<commit_message>
Quita del repositorio lo del concurso
El repositorio es solo del sistema: hardware, firmware, configuracion,
documentacion tecnica, guias e historial. Sale docs/concurso/ y las
menciones al concurso en el 00, el README y el censo. Entregables
regenerados.

Co-Authored-By: Claude Opus 5.5 <noreply@anthropic.com>
</commit_message>
<xml_diff>
--- a/docs/entregables/00_ESTADO_ACTUAL_PROYECTO.docx
+++ b/docs/entregables/00_ESTADO_ACTUAL_PROYECTO.docx
@@ -128,25 +128,7 @@
           <w:color w:val="0B0B0B"/>
           <w:sz w:val="21"/>
         </w:rPr>
-        <w:t xml:space="preserve">. Postulado a </w:t>
-      </w:r>
-      <w:r>
-        <w:rPr>
-          <w:b/>
-          <w:i w:val="0"/>
-          <w:color w:val="0B0B0B"/>
-          <w:sz w:val="21"/>
-        </w:rPr>
-        <w:t>NEIVA FEST Reto Innova 2026</w:t>
-      </w:r>
-      <w:r>
-        <w:rPr>
-          <w:b w:val="0"/>
-          <w:i w:val="0"/>
-          <w:color w:val="0B0B0B"/>
-          <w:sz w:val="21"/>
-        </w:rPr>
-        <w:t xml:space="preserve"> (22-oct). Próximo hito: montaje completo y primera salida a campo a mediados de noviembre (§9)</w:t>
+        <w:t>. Próximo hito: montaje completo y primera salida a campo a mediados de noviembre (§9)</w:t>
       </w:r>
     </w:p>
     <w:p>
@@ -406,37 +388,6 @@
           <w:sz w:val="21"/>
         </w:rPr>
         <w:t xml:space="preserve">3.  </w:t>
-      </w:r>
-      <w:r>
-        <w:rPr>
-          <w:b/>
-          <w:i w:val="0"/>
-          <w:color w:val="0B0B0B"/>
-          <w:sz w:val="21"/>
-        </w:rPr>
-        <w:t>Concurso.</w:t>
-      </w:r>
-      <w:r>
-        <w:rPr>
-          <w:b w:val="0"/>
-          <w:i w:val="0"/>
-          <w:color w:val="0B0B0B"/>
-          <w:sz w:val="21"/>
-        </w:rPr>
-        <w:t xml:space="preserve"> RiceVi se postuló a NEIVA FEST Reto Innova 2026 con los anexos 2 a 5 y el pitch (§10).</w:t>
-      </w:r>
-    </w:p>
-    <w:p>
-      <w:pPr>
-        <w:spacing w:after="40"/>
-        <w:ind w:left="340"/>
-      </w:pPr>
-      <w:r>
-        <w:rPr>
-          <w:color w:val="52514E"/>
-          <w:sz w:val="21"/>
-        </w:rPr>
-        <w:t xml:space="preserve">4.  </w:t>
       </w:r>
       <w:r>
         <w:rPr>
@@ -1807,44 +1758,6 @@
       </w:r>
     </w:p>
     <w:p>
-      <w:r>
-        <w:rPr>
-          <w:b w:val="0"/>
-          <w:i/>
-          <w:color w:val="0B0B0B"/>
-          <w:sz w:val="21"/>
-        </w:rPr>
-        <w:t>Nota sobre el concurso (§10):</w:t>
-      </w:r>
-      <w:r>
-        <w:rPr>
-          <w:b w:val="0"/>
-          <w:i w:val="0"/>
-          <w:color w:val="0B0B0B"/>
-          <w:sz w:val="21"/>
-        </w:rPr>
-        <w:t xml:space="preserve"> allí las cifras de kg/ha y pesos se presentan como </w:t>
-      </w:r>
-      <w:r>
-        <w:rPr>
-          <w:b/>
-          <w:i w:val="0"/>
-          <w:color w:val="0B0B0B"/>
-          <w:sz w:val="21"/>
-        </w:rPr>
-        <w:t>escenarios calculados</w:t>
-      </w:r>
-      <w:r>
-        <w:rPr>
-          <w:b w:val="0"/>
-          <w:i w:val="0"/>
-          <w:color w:val="0B0B0B"/>
-          <w:sz w:val="21"/>
-        </w:rPr>
-        <w:t xml:space="preserve"> sobre la pérdida de referencia del cabezal, no como resultados medidos. No cambian este límite: la tesis no las afirma hasta medirlas en campo.</w:t>
-      </w:r>
-    </w:p>
-    <w:p>
       <w:pPr>
         <w:spacing w:before="120" w:after="120"/>
         <w:pBdr>
@@ -4618,7 +4531,7 @@
                 <w:color w:val="0B0B0B"/>
                 <w:sz w:val="18"/>
               </w:rPr>
-              <w:t>La central descarta latitud y longitud al leer la trama. Es lo declarado en el concurso: «el GPS solo mide la velocidad»; la ubicación de los lotes es dato reservado del productor</w:t>
+              <w:t>La central descarta latitud y longitud al leer la trama: el GPS solo mide la velocidad, y la ubicación de los lotes es dato reservado del productor</w:t>
             </w:r>
           </w:p>
         </w:tc>
@@ -9173,7 +9086,7 @@
                 <w:color w:val="8B2E2E"/>
                 <w:sz w:val="16"/>
               </w:rPr>
-              <w:t>config-ricevi-campo/docs/concurso/</w:t>
+              <w:t>config-ricevi-campo/docs/historico/</w:t>
             </w:r>
           </w:p>
         </w:tc>
@@ -9193,7 +9106,7 @@
                 <w:color w:val="0B0B0B"/>
                 <w:sz w:val="18"/>
               </w:rPr>
-              <w:t>Resumen de la postulación a NEIVA FEST (sin datos personales)</w:t>
+              <w:t>Versiones anteriores de este archivo</w:t>
             </w:r>
           </w:p>
         </w:tc>
@@ -9216,7 +9129,26 @@
                 <w:color w:val="8B2E2E"/>
                 <w:sz w:val="16"/>
               </w:rPr>
-              <w:t>config-ricevi-campo/docs/historico/</w:t>
+              <w:t>PROYECTO/docs/conexiones_nodos_y_central.html</w:t>
+            </w:r>
+            <w:r>
+              <w:rPr>
+                <w:b w:val="0"/>
+                <w:i w:val="0"/>
+                <w:color w:val="0B0B0B"/>
+                <w:sz w:val="18"/>
+              </w:rPr>
+              <w:t xml:space="preserve">, </w:t>
+            </w:r>
+            <w:r>
+              <w:rPr>
+                <w:rFonts w:ascii="Consolas" w:hAnsi="Consolas"/>
+                <w:b w:val="0"/>
+                <w:i w:val="0"/>
+                <w:color w:val="8B2E2E"/>
+                <w:sz w:val="16"/>
+              </w:rPr>
+              <w:t>puesta_en_marcha.html</w:t>
             </w:r>
           </w:p>
         </w:tc>
@@ -9236,7 +9168,92 @@
                 <w:color w:val="0B0B0B"/>
                 <w:sz w:val="18"/>
               </w:rPr>
-              <w:t>Versiones anteriores de este archivo</w:t>
+              <w:t xml:space="preserve">Páginas de cableado y de puesta en mesa (15–21-oct). </w:t>
+            </w:r>
+            <w:r>
+              <w:rPr>
+                <w:b/>
+                <w:i w:val="0"/>
+                <w:color w:val="0B0B0B"/>
+                <w:sz w:val="18"/>
+              </w:rPr>
+              <w:t xml:space="preserve">Todavía muestran </w:t>
+            </w:r>
+            <w:r>
+              <w:rPr>
+                <w:rFonts w:ascii="Consolas" w:hAnsi="Consolas"/>
+                <w:b/>
+                <w:i w:val="0"/>
+                <w:color w:val="8B2E2E"/>
+                <w:sz w:val="16"/>
+              </w:rPr>
+              <w:t>NH02</w:t>
+            </w:r>
+            <w:r>
+              <w:rPr>
+                <w:b w:val="0"/>
+                <w:i w:val="0"/>
+                <w:color w:val="0B0B0B"/>
+                <w:sz w:val="18"/>
+              </w:rPr>
+              <w:t xml:space="preserve">, ahora con un aviso arriba: el cableado de </w:t>
+            </w:r>
+            <w:r>
+              <w:rPr>
+                <w:rFonts w:ascii="Consolas" w:hAnsi="Consolas"/>
+                <w:b w:val="0"/>
+                <w:i w:val="0"/>
+                <w:color w:val="8B2E2E"/>
+                <w:sz w:val="16"/>
+              </w:rPr>
+              <w:t>NH01</w:t>
+            </w:r>
+            <w:r>
+              <w:rPr>
+                <w:b w:val="0"/>
+                <w:i w:val="0"/>
+                <w:color w:val="0B0B0B"/>
+                <w:sz w:val="18"/>
+              </w:rPr>
+              <w:t xml:space="preserve">, </w:t>
+            </w:r>
+            <w:r>
+              <w:rPr>
+                <w:rFonts w:ascii="Consolas" w:hAnsi="Consolas"/>
+                <w:b w:val="0"/>
+                <w:i w:val="0"/>
+                <w:color w:val="8B2E2E"/>
+                <w:sz w:val="16"/>
+              </w:rPr>
+              <w:t>NU01</w:t>
+            </w:r>
+            <w:r>
+              <w:rPr>
+                <w:b w:val="0"/>
+                <w:i w:val="0"/>
+                <w:color w:val="0B0B0B"/>
+                <w:sz w:val="18"/>
+              </w:rPr>
+              <w:t>/</w:t>
+            </w:r>
+            <w:r>
+              <w:rPr>
+                <w:rFonts w:ascii="Consolas" w:hAnsi="Consolas"/>
+                <w:b w:val="0"/>
+                <w:i w:val="0"/>
+                <w:color w:val="8B2E2E"/>
+                <w:sz w:val="16"/>
+              </w:rPr>
+              <w:t>NU02</w:t>
+            </w:r>
+            <w:r>
+              <w:rPr>
+                <w:b w:val="0"/>
+                <w:i w:val="0"/>
+                <w:color w:val="0B0B0B"/>
+                <w:sz w:val="18"/>
+              </w:rPr>
+              <w:t xml:space="preserve"> y cámaras sigue valiendo; lo de la rueda no</w:t>
             </w:r>
           </w:p>
         </w:tc>
@@ -9259,26 +9276,7 @@
                 <w:color w:val="8B2E2E"/>
                 <w:sz w:val="16"/>
               </w:rPr>
-              <w:t>PROYECTO/docs/conexiones_nodos_y_central.html</w:t>
-            </w:r>
-            <w:r>
-              <w:rPr>
-                <w:b w:val="0"/>
-                <w:i w:val="0"/>
-                <w:color w:val="0B0B0B"/>
-                <w:sz w:val="18"/>
-              </w:rPr>
-              <w:t xml:space="preserve">, </w:t>
-            </w:r>
-            <w:r>
-              <w:rPr>
-                <w:rFonts w:ascii="Consolas" w:hAnsi="Consolas"/>
-                <w:b w:val="0"/>
-                <w:i w:val="0"/>
-                <w:color w:val="8B2E2E"/>
-                <w:sz w:val="16"/>
-              </w:rPr>
-              <w:t>puesta_en_marcha.html</w:t>
+              <w:t>prubea-conex/</w:t>
             </w:r>
           </w:p>
         </w:tc>
@@ -9298,92 +9296,7 @@
                 <w:color w:val="0B0B0B"/>
                 <w:sz w:val="18"/>
               </w:rPr>
-              <w:t xml:space="preserve">Páginas de cableado y de puesta en mesa (15–21-oct). </w:t>
-            </w:r>
-            <w:r>
-              <w:rPr>
-                <w:b/>
-                <w:i w:val="0"/>
-                <w:color w:val="0B0B0B"/>
-                <w:sz w:val="18"/>
-              </w:rPr>
-              <w:t xml:space="preserve">Todavía muestran </w:t>
-            </w:r>
-            <w:r>
-              <w:rPr>
-                <w:rFonts w:ascii="Consolas" w:hAnsi="Consolas"/>
-                <w:b/>
-                <w:i w:val="0"/>
-                <w:color w:val="8B2E2E"/>
-                <w:sz w:val="16"/>
-              </w:rPr>
-              <w:t>NH02</w:t>
-            </w:r>
-            <w:r>
-              <w:rPr>
-                <w:b w:val="0"/>
-                <w:i w:val="0"/>
-                <w:color w:val="0B0B0B"/>
-                <w:sz w:val="18"/>
-              </w:rPr>
-              <w:t xml:space="preserve">, ahora con un aviso arriba: el cableado de </w:t>
-            </w:r>
-            <w:r>
-              <w:rPr>
-                <w:rFonts w:ascii="Consolas" w:hAnsi="Consolas"/>
-                <w:b w:val="0"/>
-                <w:i w:val="0"/>
-                <w:color w:val="8B2E2E"/>
-                <w:sz w:val="16"/>
-              </w:rPr>
-              <w:t>NH01</w:t>
-            </w:r>
-            <w:r>
-              <w:rPr>
-                <w:b w:val="0"/>
-                <w:i w:val="0"/>
-                <w:color w:val="0B0B0B"/>
-                <w:sz w:val="18"/>
-              </w:rPr>
-              <w:t xml:space="preserve">, </w:t>
-            </w:r>
-            <w:r>
-              <w:rPr>
-                <w:rFonts w:ascii="Consolas" w:hAnsi="Consolas"/>
-                <w:b w:val="0"/>
-                <w:i w:val="0"/>
-                <w:color w:val="8B2E2E"/>
-                <w:sz w:val="16"/>
-              </w:rPr>
-              <w:t>NU01</w:t>
-            </w:r>
-            <w:r>
-              <w:rPr>
-                <w:b w:val="0"/>
-                <w:i w:val="0"/>
-                <w:color w:val="0B0B0B"/>
-                <w:sz w:val="18"/>
-              </w:rPr>
-              <w:t>/</w:t>
-            </w:r>
-            <w:r>
-              <w:rPr>
-                <w:rFonts w:ascii="Consolas" w:hAnsi="Consolas"/>
-                <w:b w:val="0"/>
-                <w:i w:val="0"/>
-                <w:color w:val="8B2E2E"/>
-                <w:sz w:val="16"/>
-              </w:rPr>
-              <w:t>NU02</w:t>
-            </w:r>
-            <w:r>
-              <w:rPr>
-                <w:b w:val="0"/>
-                <w:i w:val="0"/>
-                <w:color w:val="0B0B0B"/>
-                <w:sz w:val="18"/>
-              </w:rPr>
-              <w:t xml:space="preserve"> y cámaras sigue valiendo; lo de la rueda no</w:t>
+              <w:t>Banco de simulación; sus medidas son de portátil y móviles, no de campo</w:t>
             </w:r>
           </w:p>
         </w:tc>
@@ -9406,7 +9319,7 @@
                 <w:color w:val="8B2E2E"/>
                 <w:sz w:val="16"/>
               </w:rPr>
-              <w:t>prubea-conex/</w:t>
+              <w:t>sistema-arroz-front/</w:t>
             </w:r>
           </w:p>
         </w:tc>
@@ -9426,7 +9339,7 @@
                 <w:color w:val="0B0B0B"/>
                 <w:sz w:val="18"/>
               </w:rPr>
-              <w:t>Banco de simulación; sus medidas son de portátil y móviles, no de campo</w:t>
+              <w:t>Landing informativa (Vercel), ya con GPS y siete nodos</w:t>
             </w:r>
           </w:p>
         </w:tc>
@@ -9449,7 +9362,7 @@
                 <w:color w:val="8B2E2E"/>
                 <w:sz w:val="16"/>
               </w:rPr>
-              <w:t>sistema-arroz-front/</w:t>
+              <w:t>modelos-3d/</w:t>
             </w:r>
           </w:p>
         </w:tc>
@@ -9469,102 +9382,7 @@
                 <w:color w:val="0B0B0B"/>
                 <w:sz w:val="18"/>
               </w:rPr>
-              <w:t>Landing informativa (Vercel), ya con GPS y siete nodos</w:t>
-            </w:r>
-          </w:p>
-        </w:tc>
-      </w:tr>
-      <w:tr>
-        <w:tc>
-          <w:tcPr>
-            <w:tcW w:type="dxa" w:w="4819"/>
-          </w:tcPr>
-          <w:p>
-            <w:pPr>
-              <w:spacing w:after="40" w:before="40"/>
-            </w:pPr>
-            <w:r/>
-            <w:r>
-              <w:rPr>
-                <w:rFonts w:ascii="Consolas" w:hAnsi="Consolas"/>
-                <w:b w:val="0"/>
-                <w:i w:val="0"/>
-                <w:color w:val="8B2E2E"/>
-                <w:sz w:val="16"/>
-              </w:rPr>
-              <w:t>modelos-3d/</w:t>
-            </w:r>
-          </w:p>
-        </w:tc>
-        <w:tc>
-          <w:tcPr>
-            <w:tcW w:type="dxa" w:w="4819"/>
-          </w:tcPr>
-          <w:p>
-            <w:pPr>
-              <w:spacing w:after="40" w:before="40"/>
-            </w:pPr>
-            <w:r/>
-            <w:r>
-              <w:rPr>
-                <w:b w:val="0"/>
-                <w:i w:val="0"/>
-                <w:color w:val="0B0B0B"/>
-                <w:sz w:val="18"/>
-              </w:rPr>
               <w:t>Soporte 3D del nodo de cámara (FreeCAD, borrador)</w:t>
-            </w:r>
-          </w:p>
-        </w:tc>
-      </w:tr>
-      <w:tr>
-        <w:tc>
-          <w:tcPr>
-            <w:tcW w:type="dxa" w:w="4819"/>
-          </w:tcPr>
-          <w:p>
-            <w:pPr>
-              <w:spacing w:after="40" w:before="40"/>
-            </w:pPr>
-            <w:r/>
-            <w:r>
-              <w:rPr>
-                <w:rFonts w:ascii="Consolas" w:hAnsi="Consolas"/>
-                <w:b w:val="0"/>
-                <w:i w:val="0"/>
-                <w:color w:val="8B2E2E"/>
-                <w:sz w:val="16"/>
-              </w:rPr>
-              <w:t>Modalidad de Grado/Concurso/Diligenciados/</w:t>
-            </w:r>
-          </w:p>
-        </w:tc>
-        <w:tc>
-          <w:tcPr>
-            <w:tcW w:type="dxa" w:w="4819"/>
-          </w:tcPr>
-          <w:p>
-            <w:pPr>
-              <w:spacing w:after="40" w:before="40"/>
-            </w:pPr>
-            <w:r/>
-            <w:r>
-              <w:rPr>
-                <w:b w:val="0"/>
-                <w:i w:val="0"/>
-                <w:color w:val="0B0B0B"/>
-                <w:sz w:val="18"/>
-              </w:rPr>
-              <w:t xml:space="preserve">Anexos 2–5 firmados (PDF) y pitch final. </w:t>
-            </w:r>
-            <w:r>
-              <w:rPr>
-                <w:b/>
-                <w:i w:val="0"/>
-                <w:color w:val="0B0B0B"/>
-                <w:sz w:val="18"/>
-              </w:rPr>
-              <w:t>Contienen datos personales: no se suben al repositorio</w:t>
             </w:r>
           </w:p>
         </w:tc>
@@ -9956,206 +9774,6 @@
           <w:sz w:val="21"/>
         </w:rPr>
         <w:t>calendario.</w:t>
-      </w:r>
-    </w:p>
-    <w:p>
-      <w:pPr>
-        <w:spacing w:before="120" w:after="120"/>
-        <w:pBdr>
-          <w:bottom w:val="single" w:sz="4" w:space="1" w:color="D6D5D0"/>
-        </w:pBdr>
-      </w:pPr>
-    </w:p>
-    <w:p>
-      <w:pPr>
-        <w:keepNext/>
-        <w:spacing w:before="320" w:after="120"/>
-        <w:pBdr>
-          <w:bottom w:val="single" w:sz="6" w:space="4" w:color="C7D2E4"/>
-        </w:pBdr>
-      </w:pPr>
-      <w:r>
-        <w:rPr>
-          <w:b/>
-          <w:i w:val="0"/>
-          <w:color w:val="1D4ED8"/>
-          <w:sz w:val="30"/>
-        </w:rPr>
-        <w:t>10. Concurso NEIVA FEST · Reto Innova 2026</w:t>
-      </w:r>
-    </w:p>
-    <w:p>
-      <w:r>
-        <w:rPr>
-          <w:b w:val="0"/>
-          <w:i w:val="0"/>
-          <w:color w:val="0B0B0B"/>
-          <w:sz w:val="21"/>
-        </w:rPr>
-        <w:t xml:space="preserve">Postulación del 22 de octubre de 2026 a la Convocatoria Pública 001 de 2026 de la Fundación Es Entre Todos, ámbito económico. Iniciativa: </w:t>
-      </w:r>
-      <w:r>
-        <w:rPr>
-          <w:b/>
-          <w:i w:val="0"/>
-          <w:color w:val="0B0B0B"/>
-          <w:sz w:val="21"/>
-        </w:rPr>
-        <w:t>«RiceVi: diagnóstico con visión artificial del corte de la cosecha mecanizada de arroz»</w:t>
-      </w:r>
-      <w:r>
-        <w:rPr>
-          <w:b w:val="0"/>
-          <w:i w:val="0"/>
-          <w:color w:val="0B0B0B"/>
-          <w:sz w:val="21"/>
-        </w:rPr>
-        <w:t>. Representante: Ferley Medina Rojas (asesor). Desarrolladores: Cesar Camilo Hoyos Diaz y Alvaro Julian Delgado Mena (USCO, 9.º semestre).</w:t>
-      </w:r>
-    </w:p>
-    <w:p>
-      <w:r>
-        <w:rPr>
-          <w:b w:val="0"/>
-          <w:i w:val="0"/>
-          <w:color w:val="0B0B0B"/>
-          <w:sz w:val="21"/>
-        </w:rPr>
-        <w:t xml:space="preserve">Resumen, cifras con sus fuentes, cronograma y plan del incentivo en </w:t>
-      </w:r>
-      <w:r>
-        <w:rPr>
-          <w:rFonts w:ascii="Consolas" w:hAnsi="Consolas"/>
-          <w:b/>
-          <w:i w:val="0"/>
-          <w:color w:val="8B2E2E"/>
-          <w:sz w:val="19"/>
-        </w:rPr>
-        <w:t>docs/concurso/README.md</w:t>
-      </w:r>
-      <w:r>
-        <w:rPr>
-          <w:b w:val="0"/>
-          <w:i w:val="0"/>
-          <w:color w:val="0B0B0B"/>
-          <w:sz w:val="21"/>
-        </w:rPr>
-        <w:t>. Lo que condiciona al proyecto:</w:t>
-      </w:r>
-    </w:p>
-    <w:p>
-      <w:pPr>
-        <w:spacing w:after="40"/>
-        <w:ind w:left="340"/>
-      </w:pPr>
-      <w:r>
-        <w:rPr>
-          <w:color w:val="52514E"/>
-          <w:sz w:val="21"/>
-        </w:rPr>
-        <w:t xml:space="preserve">•  </w:t>
-      </w:r>
-      <w:r>
-        <w:rPr>
-          <w:b/>
-          <w:i w:val="0"/>
-          <w:color w:val="0B0B0B"/>
-          <w:sz w:val="21"/>
-        </w:rPr>
-        <w:t>Compromisos públicos:</w:t>
-      </w:r>
-      <w:r>
-        <w:rPr>
-          <w:b w:val="0"/>
-          <w:i w:val="0"/>
-          <w:color w:val="0B0B0B"/>
-          <w:sz w:val="21"/>
-        </w:rPr>
-        <w:t xml:space="preserve"> el GPS solo mide la velocidad (C35); el sistema no se conecta a la máquina (C26);</w:t>
-      </w:r>
-    </w:p>
-    <w:p>
-      <w:r>
-        <w:rPr>
-          <w:b w:val="0"/>
-          <w:i w:val="0"/>
-          <w:color w:val="0B0B0B"/>
-          <w:sz w:val="21"/>
-        </w:rPr>
-        <w:t>sin modelo no se muestra un número (C16); el dataset se divide por jornada (C29).</w:t>
-      </w:r>
-    </w:p>
-    <w:p>
-      <w:pPr>
-        <w:spacing w:after="40"/>
-        <w:ind w:left="340"/>
-      </w:pPr>
-      <w:r>
-        <w:rPr>
-          <w:color w:val="52514E"/>
-          <w:sz w:val="21"/>
-        </w:rPr>
-        <w:t xml:space="preserve">•  </w:t>
-      </w:r>
-      <w:r>
-        <w:rPr>
-          <w:b/>
-          <w:i w:val="0"/>
-          <w:color w:val="0B0B0B"/>
-          <w:sz w:val="21"/>
-        </w:rPr>
-        <w:t>Cronograma comprometido:</w:t>
-      </w:r>
-      <w:r>
-        <w:rPr>
-          <w:b w:val="0"/>
-          <w:i w:val="0"/>
-          <w:color w:val="0B0B0B"/>
-          <w:sz w:val="21"/>
-        </w:rPr>
-        <w:t xml:space="preserve"> montaje hasta mediados de noviembre de 2026 → captura hasta diciembre →</w:t>
-      </w:r>
-    </w:p>
-    <w:p>
-      <w:r>
-        <w:rPr>
-          <w:b w:val="0"/>
-          <w:i w:val="0"/>
-          <w:color w:val="0B0B0B"/>
-          <w:sz w:val="21"/>
-        </w:rPr>
-        <w:t>etiquetado y entrenamiento noviembre–enero → primeras salidas con modelos enero–febrero de 2027.</w:t>
-      </w:r>
-    </w:p>
-    <w:p>
-      <w:pPr>
-        <w:spacing w:after="40"/>
-        <w:ind w:left="340"/>
-      </w:pPr>
-      <w:r>
-        <w:rPr>
-          <w:color w:val="52514E"/>
-          <w:sz w:val="21"/>
-        </w:rPr>
-        <w:t xml:space="preserve">•  </w:t>
-      </w:r>
-      <w:r>
-        <w:rPr>
-          <w:b/>
-          <w:i w:val="0"/>
-          <w:color w:val="0B0B0B"/>
-          <w:sz w:val="21"/>
-        </w:rPr>
-        <w:t>El anexo 2 cita 40 comprobaciones automáticas;</w:t>
-      </w:r>
-      <w:r>
-        <w:rPr>
-          <w:b w:val="0"/>
-          <w:i w:val="0"/>
-          <w:color w:val="0B0B0B"/>
-          <w:sz w:val="21"/>
-        </w:rPr>
-        <w:t xml:space="preserve"> con el GPS hoy son 50.</w:t>
       </w:r>
     </w:p>
     <w:sectPr>

</xml_diff>

<commit_message>
Quita las referencias al banco de pruebas
El repositorio describe solo el sistema de campo y sus avances. Salen las
menciones a prubea-conex del README, el 00, modelos/ y el firmware comun.
generar_documentos.ps1 deja de usar el entorno del banco: usa su propio
.venv-docs (no versionado) o RICEVI_PY_DOCS. Entregables regenerados.

Co-Authored-By: Claude Opus 5.5 <noreply@anthropic.com>
</commit_message>
<xml_diff>
--- a/docs/entregables/00_ESTADO_ACTUAL_PROYECTO.docx
+++ b/docs/entregables/00_ESTADO_ACTUAL_PROYECTO.docx
@@ -9254,49 +9254,6 @@
                 <w:sz w:val="18"/>
               </w:rPr>
               <w:t xml:space="preserve"> y cámaras sigue valiendo; lo de la rueda no</w:t>
-            </w:r>
-          </w:p>
-        </w:tc>
-      </w:tr>
-      <w:tr>
-        <w:tc>
-          <w:tcPr>
-            <w:tcW w:type="dxa" w:w="4819"/>
-          </w:tcPr>
-          <w:p>
-            <w:pPr>
-              <w:spacing w:after="40" w:before="40"/>
-            </w:pPr>
-            <w:r/>
-            <w:r>
-              <w:rPr>
-                <w:rFonts w:ascii="Consolas" w:hAnsi="Consolas"/>
-                <w:b w:val="0"/>
-                <w:i w:val="0"/>
-                <w:color w:val="8B2E2E"/>
-                <w:sz w:val="16"/>
-              </w:rPr>
-              <w:t>prubea-conex/</w:t>
-            </w:r>
-          </w:p>
-        </w:tc>
-        <w:tc>
-          <w:tcPr>
-            <w:tcW w:type="dxa" w:w="4819"/>
-          </w:tcPr>
-          <w:p>
-            <w:pPr>
-              <w:spacing w:after="40" w:before="40"/>
-            </w:pPr>
-            <w:r/>
-            <w:r>
-              <w:rPr>
-                <w:b w:val="0"/>
-                <w:i w:val="0"/>
-                <w:color w:val="0B0B0B"/>
-                <w:sz w:val="18"/>
-              </w:rPr>
-              <w:t>Banco de simulación; sus medidas son de portátil y móviles, no de campo</w:t>
             </w:r>
           </w:p>
         </w:tc>

</xml_diff>